<commit_message>
Änderung bei API Luftverschmutzung
</commit_message>
<xml_diff>
--- a/API Ideen.docx
+++ b/API Ideen.docx
@@ -21,7 +21,7 @@
     </w:p>
     <w:p>
       <w:pPr>
-        <w:pStyle w:val="ListParagraph"/>
+        <w:pStyle w:val="Listenabsatz"/>
         <w:numPr>
           <w:ilvl w:val="0"/>
           <w:numId w:val="2"/>
@@ -36,7 +36,7 @@
     </w:p>
     <w:p>
       <w:pPr>
-        <w:pStyle w:val="ListParagraph"/>
+        <w:pStyle w:val="Listenabsatz"/>
         <w:numPr>
           <w:ilvl w:val="0"/>
           <w:numId w:val="2"/>
@@ -51,7 +51,7 @@
     </w:p>
     <w:p>
       <w:pPr>
-        <w:pStyle w:val="ListParagraph"/>
+        <w:pStyle w:val="Listenabsatz"/>
         <w:numPr>
           <w:ilvl w:val="0"/>
           <w:numId w:val="2"/>
@@ -81,7 +81,7 @@
     </w:p>
     <w:p>
       <w:pPr>
-        <w:pStyle w:val="ListParagraph"/>
+        <w:pStyle w:val="Listenabsatz"/>
         <w:numPr>
           <w:ilvl w:val="0"/>
           <w:numId w:val="2"/>
@@ -93,7 +93,7 @@
     </w:p>
     <w:p>
       <w:pPr>
-        <w:pStyle w:val="ListParagraph"/>
+        <w:pStyle w:val="Listenabsatz"/>
         <w:numPr>
           <w:ilvl w:val="0"/>
           <w:numId w:val="2"/>
@@ -108,7 +108,7 @@
     </w:p>
     <w:p>
       <w:pPr>
-        <w:pStyle w:val="ListParagraph"/>
+        <w:pStyle w:val="Listenabsatz"/>
         <w:numPr>
           <w:ilvl w:val="0"/>
           <w:numId w:val="2"/>
@@ -120,7 +120,7 @@
     </w:p>
     <w:p>
       <w:pPr>
-        <w:pStyle w:val="ListParagraph"/>
+        <w:pStyle w:val="Listenabsatz"/>
         <w:numPr>
           <w:ilvl w:val="0"/>
           <w:numId w:val="2"/>
@@ -132,7 +132,7 @@
     </w:p>
     <w:p>
       <w:pPr>
-        <w:pStyle w:val="ListParagraph"/>
+        <w:pStyle w:val="Listenabsatz"/>
         <w:numPr>
           <w:ilvl w:val="0"/>
           <w:numId w:val="2"/>
@@ -144,7 +144,7 @@
     </w:p>
     <w:p>
       <w:pPr>
-        <w:pStyle w:val="ListParagraph"/>
+        <w:pStyle w:val="Listenabsatz"/>
         <w:numPr>
           <w:ilvl w:val="0"/>
           <w:numId w:val="2"/>
@@ -171,7 +171,7 @@
     </w:p>
     <w:p>
       <w:pPr>
-        <w:pStyle w:val="ListParagraph"/>
+        <w:pStyle w:val="Listenabsatz"/>
         <w:numPr>
           <w:ilvl w:val="0"/>
           <w:numId w:val="2"/>
@@ -201,7 +201,7 @@
     </w:p>
     <w:p>
       <w:pPr>
-        <w:pStyle w:val="ListParagraph"/>
+        <w:pStyle w:val="Listenabsatz"/>
         <w:numPr>
           <w:ilvl w:val="0"/>
           <w:numId w:val="1"/>
@@ -213,7 +213,7 @@
     </w:p>
     <w:p>
       <w:pPr>
-        <w:pStyle w:val="ListParagraph"/>
+        <w:pStyle w:val="Listenabsatz"/>
         <w:numPr>
           <w:ilvl w:val="0"/>
           <w:numId w:val="1"/>
@@ -225,7 +225,7 @@
     </w:p>
     <w:p>
       <w:pPr>
-        <w:pStyle w:val="ListParagraph"/>
+        <w:pStyle w:val="Listenabsatz"/>
         <w:numPr>
           <w:ilvl w:val="0"/>
           <w:numId w:val="1"/>
@@ -237,19 +237,27 @@
     </w:p>
     <w:p>
       <w:pPr>
-        <w:pStyle w:val="ListParagraph"/>
+        <w:pStyle w:val="Listenabsatz"/>
         <w:numPr>
           <w:ilvl w:val="0"/>
           <w:numId w:val="1"/>
         </w:numPr>
       </w:pPr>
       <w:r>
-        <w:t>Wie verhalten sich dazu die Rückflüsse durch Personen die den Film sehen</w:t>
-      </w:r>
-    </w:p>
-    <w:p>
-      <w:pPr>
-        <w:pStyle w:val="ListParagraph"/>
+        <w:t xml:space="preserve">Wie verhalten sich dazu die Rückflüsse durch </w:t>
+      </w:r>
+      <w:proofErr w:type="gramStart"/>
+      <w:r>
+        <w:t>Personen</w:t>
+      </w:r>
+      <w:proofErr w:type="gramEnd"/>
+      <w:r>
+        <w:t xml:space="preserve"> die den Film sehen</w:t>
+      </w:r>
+    </w:p>
+    <w:p>
+      <w:pPr>
+        <w:pStyle w:val="Listenabsatz"/>
         <w:numPr>
           <w:ilvl w:val="0"/>
           <w:numId w:val="1"/>
@@ -261,7 +269,7 @@
     </w:p>
     <w:p>
       <w:pPr>
-        <w:pStyle w:val="ListParagraph"/>
+        <w:pStyle w:val="Listenabsatz"/>
         <w:numPr>
           <w:ilvl w:val="0"/>
           <w:numId w:val="1"/>
@@ -273,7 +281,7 @@
     </w:p>
     <w:p>
       <w:pPr>
-        <w:pStyle w:val="ListParagraph"/>
+        <w:pStyle w:val="Listenabsatz"/>
         <w:numPr>
           <w:ilvl w:val="0"/>
           <w:numId w:val="1"/>
@@ -291,7 +299,7 @@
     </w:p>
     <w:p>
       <w:pPr>
-        <w:pStyle w:val="ListParagraph"/>
+        <w:pStyle w:val="Listenabsatz"/>
         <w:numPr>
           <w:ilvl w:val="0"/>
           <w:numId w:val="1"/>
@@ -303,7 +311,7 @@
     </w:p>
     <w:p>
       <w:pPr>
-        <w:pStyle w:val="ListParagraph"/>
+        <w:pStyle w:val="Listenabsatz"/>
         <w:numPr>
           <w:ilvl w:val="0"/>
           <w:numId w:val="1"/>
@@ -315,7 +323,7 @@
     </w:p>
     <w:p>
       <w:pPr>
-        <w:pStyle w:val="ListParagraph"/>
+        <w:pStyle w:val="Listenabsatz"/>
         <w:numPr>
           <w:ilvl w:val="0"/>
           <w:numId w:val="1"/>
@@ -327,7 +335,7 @@
     </w:p>
     <w:p>
       <w:pPr>
-        <w:pStyle w:val="ListParagraph"/>
+        <w:pStyle w:val="Listenabsatz"/>
         <w:numPr>
           <w:ilvl w:val="0"/>
           <w:numId w:val="1"/>
@@ -339,7 +347,7 @@
     </w:p>
     <w:p>
       <w:pPr>
-        <w:pStyle w:val="ListParagraph"/>
+        <w:pStyle w:val="Listenabsatz"/>
         <w:numPr>
           <w:ilvl w:val="0"/>
           <w:numId w:val="1"/>
@@ -400,7 +408,6 @@
         <w:t>- die bieten auch ne API an, aber da habe ich jetzt noch nicht so ausführlich durchgeguckt, was man dort anfragen kann. Aber die könnte vllt. Lücken ergänzen, die es bei der andern API gibt</w:t>
       </w:r>
     </w:p>
-    <w:p/>
     <w:p>
       <w:hyperlink r:id="rId8" w:history="1">
         <w:r>
@@ -418,207 +425,879 @@
     </w:p>
     <w:p/>
     <w:p>
-      <w:r>
+      <w:pPr>
+        <w:rPr>
+          <w:b/>
+          <w:bCs/>
+          <w:u w:val="single"/>
+        </w:rPr>
+      </w:pPr>
+      <w:proofErr w:type="gramStart"/>
+      <w:r>
+        <w:rPr>
+          <w:b/>
+          <w:bCs/>
+          <w:u w:val="single"/>
+        </w:rPr>
         <w:t>API Luftqualität</w:t>
       </w:r>
-    </w:p>
-    <w:p>
-      <w:pPr>
-        <w:pStyle w:val="ListParagraph"/>
+      <w:proofErr w:type="gramEnd"/>
+    </w:p>
+    <w:p>
+      <w:pPr>
+        <w:pStyle w:val="Listenabsatz"/>
         <w:numPr>
           <w:ilvl w:val="0"/>
           <w:numId w:val="1"/>
         </w:numPr>
-      </w:pPr>
-      <w:r>
-        <w:t xml:space="preserve">1 Wie verändert sich die Luftverschmutzung über die Jahre </w:t>
-      </w:r>
-    </w:p>
-    <w:p>
-      <w:pPr>
-        <w:pStyle w:val="ListParagraph"/>
+        <w:rPr>
+          <w:u w:val="single"/>
+        </w:rPr>
+      </w:pPr>
+      <w:r>
+        <w:rPr>
+          <w:u w:val="single"/>
+        </w:rPr>
+        <w:t xml:space="preserve">1 </w:t>
+      </w:r>
+      <w:r>
+        <w:rPr>
+          <w:u w:val="single"/>
+        </w:rPr>
+        <w:t>Langfristige Entwicklung der Luftverschmutzung</w:t>
+      </w:r>
+    </w:p>
+    <w:p>
+      <w:pPr>
+        <w:pStyle w:val="Listenabsatz"/>
+      </w:pPr>
+      <w:r>
+        <w:t>Wie haben sich die Jahresmittelwerte der Konzentrationen von PM10, PM2.5 und NO₂ in Deutschland im Zeitraum 200</w:t>
+      </w:r>
+      <w:r>
+        <w:t>0</w:t>
+      </w:r>
+      <w:r>
+        <w:t>–202</w:t>
+      </w:r>
+      <w:r>
+        <w:t>5</w:t>
+      </w:r>
+      <w:r>
+        <w:t xml:space="preserve"> entwickelt?</w:t>
+      </w:r>
+      <w:r>
+        <w:t xml:space="preserve"> (könnte man auch auf Monate runterbrechen)</w:t>
+      </w:r>
+    </w:p>
+    <w:p>
+      <w:pPr>
+        <w:pStyle w:val="Listenabsatz"/>
+      </w:pPr>
+    </w:p>
+    <w:p>
+      <w:pPr>
+        <w:pStyle w:val="Listenabsatz"/>
         <w:numPr>
           <w:ilvl w:val="0"/>
           <w:numId w:val="1"/>
         </w:numPr>
-      </w:pPr>
-      <w:r>
-        <w:t>1.1 Luftqualitätveränderung zu Corona</w:t>
-      </w:r>
-    </w:p>
-    <w:p>
-      <w:pPr>
-        <w:pStyle w:val="ListParagraph"/>
+        <w:rPr>
+          <w:u w:val="single"/>
+        </w:rPr>
+      </w:pPr>
+      <w:r>
+        <w:rPr>
+          <w:u w:val="single"/>
+        </w:rPr>
+        <w:t xml:space="preserve">1.1 </w:t>
+      </w:r>
+      <w:r>
+        <w:rPr>
+          <w:u w:val="single"/>
+        </w:rPr>
+        <w:t>Einfluss der COVID-19-Pandemie</w:t>
+      </w:r>
+    </w:p>
+    <w:p>
+      <w:pPr>
+        <w:pStyle w:val="Listenabsatz"/>
+      </w:pPr>
+      <w:r>
+        <w:t>Gab es während der COVID-19-bedingten Mobilitätseinschränkungen (März–Mai 2020) signifikante Veränderungen der NO₂- und PM10-Konzentrationen im Vergleich zu den Vorjahreszeiträumen 2017–2019?</w:t>
+      </w:r>
+      <w:r>
+        <w:t xml:space="preserve"> (</w:t>
+      </w:r>
+      <w:proofErr w:type="spellStart"/>
+      <w:r>
+        <w:t>maybe</w:t>
+      </w:r>
+      <w:proofErr w:type="spellEnd"/>
+      <w:r>
+        <w:t xml:space="preserve"> zwei Jahre vorher und nachher abbilden)</w:t>
+      </w:r>
+    </w:p>
+    <w:p>
+      <w:pPr>
+        <w:pStyle w:val="Listenabsatz"/>
+      </w:pPr>
+    </w:p>
+    <w:p>
+      <w:pPr>
+        <w:pStyle w:val="Listenabsatz"/>
         <w:numPr>
           <w:ilvl w:val="0"/>
           <w:numId w:val="1"/>
         </w:numPr>
-      </w:pPr>
-      <w:r>
+        <w:rPr>
+          <w:u w:val="single"/>
+        </w:rPr>
+      </w:pPr>
+      <w:r>
+        <w:rPr>
+          <w:u w:val="single"/>
+        </w:rPr>
         <w:t xml:space="preserve">1.2 </w:t>
       </w:r>
       <w:r>
-        <w:t>Wie ist die Qualität an verschiedenen Neujahren hintereiander</w:t>
-      </w:r>
-    </w:p>
-    <w:p>
-      <w:pPr>
-        <w:pStyle w:val="ListParagraph"/>
+        <w:rPr>
+          <w:u w:val="single"/>
+        </w:rPr>
+        <w:t>Neujahrseffekt (Feuerwerk)</w:t>
+      </w:r>
+    </w:p>
+    <w:p>
+      <w:pPr>
+        <w:pStyle w:val="Listenabsatz"/>
+      </w:pPr>
+      <w:r>
+        <w:t>Unterscheiden sich die PM10</w:t>
+      </w:r>
+      <w:r>
+        <w:t xml:space="preserve"> und PM2</w:t>
+      </w:r>
+      <w:r>
+        <w:t>-Tagesmittelwerte am 1. Januar signifikant zwischen den Jahren 20</w:t>
+      </w:r>
+      <w:r>
+        <w:t>00</w:t>
+      </w:r>
+      <w:r>
+        <w:t>–202</w:t>
+      </w:r>
+      <w:r>
+        <w:t>5</w:t>
+      </w:r>
+      <w:r>
+        <w:t>?</w:t>
+      </w:r>
+    </w:p>
+    <w:p>
+      <w:pPr>
+        <w:pStyle w:val="Listenabsatz"/>
+      </w:pPr>
+    </w:p>
+    <w:p>
+      <w:pPr>
+        <w:pStyle w:val="Listenabsatz"/>
         <w:numPr>
           <w:ilvl w:val="0"/>
           <w:numId w:val="1"/>
         </w:numPr>
-      </w:pPr>
-      <w:r>
+        <w:rPr>
+          <w:u w:val="single"/>
+        </w:rPr>
+      </w:pPr>
+      <w:r>
+        <w:rPr>
+          <w:u w:val="single"/>
+        </w:rPr>
         <w:t xml:space="preserve">2 </w:t>
       </w:r>
       <w:r>
-        <w:t>W</w:t>
-      </w:r>
-      <w:r>
-        <w:t xml:space="preserve">ie wirkst sich die Nähe zu Hauptverkehrstraßen auf die bsp. NO2-Konzentration aus </w:t>
-      </w:r>
-      <w:r>
-        <w:t>(Gibt es für Autobahnen Daten)</w:t>
-      </w:r>
-    </w:p>
-    <w:p>
-      <w:pPr>
-        <w:pStyle w:val="ListParagraph"/>
+        <w:rPr>
+          <w:u w:val="single"/>
+        </w:rPr>
+        <w:t>Nähe zu Hauptverkehrsstraßen</w:t>
+      </w:r>
+    </w:p>
+    <w:p>
+      <w:pPr>
+        <w:pStyle w:val="Listenabsatz"/>
+      </w:pPr>
+      <w:r>
+        <w:t>Unterscheiden sich die mittleren NO₂-Konzentrationen signifikant zwischen Verkehrsstationen und Hintergrundstationen in urbanen Gebieten?</w:t>
+      </w:r>
+    </w:p>
+    <w:p>
+      <w:pPr>
+        <w:pStyle w:val="Listenabsatz"/>
+      </w:pPr>
+    </w:p>
+    <w:p>
+      <w:pPr>
+        <w:pStyle w:val="Listenabsatz"/>
         <w:numPr>
           <w:ilvl w:val="0"/>
           <w:numId w:val="1"/>
         </w:numPr>
-      </w:pPr>
-      <w:r>
+        <w:rPr>
+          <w:u w:val="single"/>
+        </w:rPr>
+      </w:pPr>
+      <w:r>
+        <w:rPr>
+          <w:u w:val="single"/>
+        </w:rPr>
         <w:t xml:space="preserve">3 </w:t>
       </w:r>
       <w:r>
-        <w:t>Luftqualität in den verschiedenen Bundesländern</w:t>
-      </w:r>
-    </w:p>
-    <w:p>
-      <w:pPr>
-        <w:pStyle w:val="ListParagraph"/>
+        <w:rPr>
+          <w:u w:val="single"/>
+        </w:rPr>
+        <w:t>Bundesländer-Vergleich</w:t>
+      </w:r>
+    </w:p>
+    <w:p>
+      <w:pPr>
+        <w:pStyle w:val="Listenabsatz"/>
+      </w:pPr>
+      <w:r>
+        <w:t>Bestehen signifikante Unterschiede in den Jahresmittelwerten von PM2.5 zwischen den Bundesländern im Zeitraum 20</w:t>
+      </w:r>
+      <w:r>
+        <w:t>00</w:t>
+      </w:r>
+      <w:r>
+        <w:t>–202</w:t>
+      </w:r>
+      <w:r>
+        <w:t>5</w:t>
+      </w:r>
+      <w:r>
+        <w:t>?</w:t>
+      </w:r>
+    </w:p>
+    <w:p>
+      <w:pPr>
+        <w:pStyle w:val="Listenabsatz"/>
+      </w:pPr>
+    </w:p>
+    <w:p>
+      <w:pPr>
+        <w:pStyle w:val="Listenabsatz"/>
         <w:numPr>
           <w:ilvl w:val="0"/>
           <w:numId w:val="1"/>
         </w:numPr>
-      </w:pPr>
-      <w:r>
+        <w:rPr>
+          <w:u w:val="single"/>
+        </w:rPr>
+      </w:pPr>
+      <w:r>
+        <w:rPr>
+          <w:u w:val="single"/>
+        </w:rPr>
         <w:t xml:space="preserve">3.1 </w:t>
       </w:r>
       <w:r>
-        <w:t>vorstädtische vs. stätisch vs. ländliche Messtationen</w:t>
-      </w:r>
-    </w:p>
-    <w:p>
-      <w:pPr>
-        <w:pStyle w:val="ListParagraph"/>
+        <w:rPr>
+          <w:u w:val="single"/>
+        </w:rPr>
+        <w:t xml:space="preserve">Urban vs. </w:t>
+      </w:r>
+      <w:r>
+        <w:rPr>
+          <w:u w:val="single"/>
+        </w:rPr>
+        <w:t>L</w:t>
+      </w:r>
+      <w:r>
+        <w:rPr>
+          <w:u w:val="single"/>
+        </w:rPr>
+        <w:t>ändlich</w:t>
+      </w:r>
+    </w:p>
+    <w:p>
+      <w:pPr>
+        <w:pStyle w:val="Listenabsatz"/>
+      </w:pPr>
+      <w:r>
+        <w:t>Unterscheiden sich PM10-Konzentrationen signifikant zwischen städtischen, vorstädtischen und ländlichen Messstationen?</w:t>
+      </w:r>
+    </w:p>
+    <w:p>
+      <w:pPr>
+        <w:pStyle w:val="Listenabsatz"/>
+      </w:pPr>
+    </w:p>
+    <w:p>
+      <w:pPr>
+        <w:pStyle w:val="Listenabsatz"/>
         <w:numPr>
           <w:ilvl w:val="0"/>
           <w:numId w:val="1"/>
         </w:numPr>
-      </w:pPr>
-      <w:r>
+        <w:rPr>
+          <w:u w:val="single"/>
+        </w:rPr>
+      </w:pPr>
+      <w:r>
+        <w:rPr>
+          <w:u w:val="single"/>
+        </w:rPr>
         <w:t xml:space="preserve">4 </w:t>
       </w:r>
       <w:r>
-        <w:t>Luftqualität Deutschland vs. andere Länder die ähnliche Daten bereitstellen (wenn möglich)</w:t>
-      </w:r>
-    </w:p>
-    <w:p>
-      <w:pPr>
-        <w:pStyle w:val="ListParagraph"/>
+        <w:rPr>
+          <w:u w:val="single"/>
+        </w:rPr>
+        <w:t>Deutschland vs. andere Länder</w:t>
+      </w:r>
+    </w:p>
+    <w:p>
+      <w:pPr>
+        <w:pStyle w:val="Listenabsatz"/>
+      </w:pPr>
+      <w:r>
+        <w:t>Wie unterscheiden sich die Jahresmittelwerte von PM2.5 zwischen Deutschland und vergleichbaren EU-Ländern im Zeitraum 20</w:t>
+      </w:r>
+      <w:r>
+        <w:t>00</w:t>
+      </w:r>
+      <w:r>
+        <w:t>–202</w:t>
+      </w:r>
+      <w:r>
+        <w:t>5</w:t>
+      </w:r>
+      <w:r>
+        <w:t>?</w:t>
+      </w:r>
+      <w:r>
+        <w:t xml:space="preserve"> </w:t>
+      </w:r>
+      <w:r>
+        <w:t>(wenn möglich)</w:t>
+      </w:r>
+    </w:p>
+    <w:p>
+      <w:pPr>
+        <w:pStyle w:val="Listenabsatz"/>
+      </w:pPr>
+    </w:p>
+    <w:p>
+      <w:pPr>
+        <w:pStyle w:val="Listenabsatz"/>
         <w:numPr>
           <w:ilvl w:val="0"/>
           <w:numId w:val="1"/>
         </w:numPr>
-      </w:pPr>
-      <w:r>
+        <w:rPr>
+          <w:u w:val="single"/>
+        </w:rPr>
+      </w:pPr>
+      <w:r>
+        <w:rPr>
+          <w:u w:val="single"/>
+        </w:rPr>
         <w:t xml:space="preserve">5 </w:t>
       </w:r>
       <w:r>
-        <w:t xml:space="preserve">Wie stark beeinflussen saisonale Effekte (Winter, Sommer) die </w:t>
-      </w:r>
-      <w:r>
-        <w:t>Feinstaub</w:t>
-      </w:r>
-      <w:r>
-        <w:t>konzentration in Deutschland</w:t>
-      </w:r>
-    </w:p>
-    <w:p>
-      <w:pPr>
-        <w:pStyle w:val="ListParagraph"/>
+        <w:rPr>
+          <w:u w:val="single"/>
+        </w:rPr>
+        <w:t>Saisonale Effekte</w:t>
+      </w:r>
+    </w:p>
+    <w:p>
+      <w:pPr>
+        <w:pStyle w:val="Listenabsatz"/>
+      </w:pPr>
+      <w:r>
+        <w:t>Wie stark variieren PM10-Konzentrationen zwischen Winter- und Sommermonaten</w:t>
+      </w:r>
+      <w:r>
+        <w:t xml:space="preserve"> (</w:t>
+      </w:r>
+      <w:r>
+        <w:t>und ist dieser Effekt in urbanen Gebieten stärker ausgeprägt</w:t>
+      </w:r>
+      <w:r>
+        <w:t>)?</w:t>
+      </w:r>
+    </w:p>
+    <w:p>
+      <w:pPr>
+        <w:pStyle w:val="Listenabsatz"/>
+      </w:pPr>
+    </w:p>
+    <w:p>
+      <w:pPr>
+        <w:pStyle w:val="Listenabsatz"/>
         <w:numPr>
           <w:ilvl w:val="0"/>
           <w:numId w:val="1"/>
         </w:numPr>
-      </w:pPr>
-      <w:r>
+        <w:rPr>
+          <w:u w:val="single"/>
+        </w:rPr>
+      </w:pPr>
+      <w:r>
+        <w:rPr>
+          <w:u w:val="single"/>
+        </w:rPr>
         <w:t xml:space="preserve">6 </w:t>
       </w:r>
       <w:r>
-        <w:t>Wie korrelieren Ozonwerte (O3) mit Temperaturdaten in verschiedenen Bundesländern</w:t>
-      </w:r>
-    </w:p>
-    <w:p>
-      <w:pPr>
-        <w:pStyle w:val="ListParagraph"/>
+        <w:rPr>
+          <w:u w:val="single"/>
+        </w:rPr>
+        <w:t>Ozon und Temperatur</w:t>
+      </w:r>
+    </w:p>
+    <w:p>
+      <w:pPr>
+        <w:pStyle w:val="Listenabsatz"/>
+      </w:pPr>
+      <w:r>
+        <w:t>Besteht eine signifikante positive Korrelation zwischen O₃-Konzentrationen und Tageshöchsttemperaturen in deutschen Bundesländern?</w:t>
+      </w:r>
+    </w:p>
+    <w:p>
+      <w:pPr>
+        <w:pStyle w:val="Listenabsatz"/>
+      </w:pPr>
+    </w:p>
+    <w:p>
+      <w:pPr>
+        <w:pStyle w:val="Listenabsatz"/>
         <w:numPr>
           <w:ilvl w:val="0"/>
           <w:numId w:val="1"/>
         </w:numPr>
-      </w:pPr>
-      <w:r>
+        <w:rPr>
+          <w:u w:val="single"/>
+        </w:rPr>
+      </w:pPr>
+      <w:r>
+        <w:rPr>
+          <w:u w:val="single"/>
+        </w:rPr>
         <w:t xml:space="preserve">7 </w:t>
       </w:r>
       <w:r>
-        <w:t>Welche Schadstoffe zeigen die stärkste langfristige Verbesserung bzw. Verschlechterung über mehrere Jahre</w:t>
-      </w:r>
-    </w:p>
-    <w:p>
-      <w:pPr>
-        <w:pStyle w:val="ListParagraph"/>
+        <w:rPr>
+          <w:u w:val="single"/>
+        </w:rPr>
+        <w:t>Langfristige Verbesserung/Verschlechterung</w:t>
+      </w:r>
+    </w:p>
+    <w:p>
+      <w:pPr>
+        <w:pStyle w:val="Listenabsatz"/>
+      </w:pPr>
+      <w:r>
+        <w:t>Welche Luftschadstoffe zeigen im Zeitraum 200</w:t>
+      </w:r>
+      <w:r>
+        <w:t>0</w:t>
+      </w:r>
+      <w:r>
+        <w:t>–202</w:t>
+      </w:r>
+      <w:r>
+        <w:t>5</w:t>
+      </w:r>
+      <w:r>
+        <w:t xml:space="preserve"> die stärksten signifikanten Trends (positiv oder negativ)?</w:t>
+      </w:r>
+    </w:p>
+    <w:p>
+      <w:pPr>
+        <w:pStyle w:val="Listenabsatz"/>
+      </w:pPr>
+    </w:p>
+    <w:p>
+      <w:pPr>
+        <w:pStyle w:val="Listenabsatz"/>
         <w:numPr>
           <w:ilvl w:val="0"/>
           <w:numId w:val="1"/>
         </w:numPr>
-      </w:pPr>
-      <w:r>
+        <w:rPr>
+          <w:u w:val="single"/>
+        </w:rPr>
+      </w:pPr>
+      <w:r>
+        <w:rPr>
+          <w:u w:val="single"/>
+        </w:rPr>
         <w:t xml:space="preserve">8 </w:t>
       </w:r>
       <w:r>
-        <w:t>Gibt es regionale Cluster hoher Luftverschmutzung, die auf strukturelle Ursachen zurückzuführen sind (Industrie, Verkehr, ...)</w:t>
-      </w:r>
-    </w:p>
-    <w:p>
-      <w:pPr>
-        <w:pStyle w:val="ListParagraph"/>
+        <w:rPr>
+          <w:u w:val="single"/>
+        </w:rPr>
+        <w:t>Regionale Cluster</w:t>
+      </w:r>
+    </w:p>
+    <w:p>
+      <w:pPr>
+        <w:pStyle w:val="Listenabsatz"/>
+      </w:pPr>
+      <w:r>
+        <w:t>Lassen sich räumliche Cluster hoher NO₂- oder PM10-Belastung identifizieren, und korrelieren diese mit Industrie- oder Verkehrsstandorten?</w:t>
+      </w:r>
+    </w:p>
+    <w:p>
+      <w:pPr>
+        <w:pStyle w:val="Listenabsatz"/>
+      </w:pPr>
+    </w:p>
+    <w:p>
+      <w:pPr>
+        <w:pStyle w:val="Listenabsatz"/>
         <w:numPr>
           <w:ilvl w:val="0"/>
           <w:numId w:val="1"/>
         </w:numPr>
-      </w:pPr>
-      <w:r>
-        <w:t xml:space="preserve">8.1 </w:t>
-      </w:r>
-      <w:r>
-        <w:t xml:space="preserve">Luftqualität in der Nähe von Industrieanlagen </w:t>
-      </w:r>
-    </w:p>
-    <w:p>
-      <w:pPr>
-        <w:pStyle w:val="ListParagraph"/>
-        <w:numPr>
-          <w:ilvl w:val="0"/>
-          <w:numId w:val="1"/>
-        </w:numPr>
-      </w:pPr>
-      <w:r>
-        <w:t>9 Tourismus und Luftverschmutzung</w:t>
-      </w:r>
+        <w:rPr>
+          <w:u w:val="single"/>
+        </w:rPr>
+      </w:pPr>
+      <w:r>
+        <w:rPr>
+          <w:u w:val="single"/>
+        </w:rPr>
+        <w:t xml:space="preserve">9 </w:t>
+      </w:r>
+      <w:r>
+        <w:rPr>
+          <w:u w:val="single"/>
+        </w:rPr>
+        <w:t>Tourismus &amp; Luftverschmutzung</w:t>
+      </w:r>
+    </w:p>
+    <w:p>
+      <w:pPr>
+        <w:pStyle w:val="Listenabsatz"/>
+      </w:pPr>
+      <w:r>
+        <w:t>Besteht ein Zusammenhang zwischen saisonalen Tourismusintensitäten und kurzfristigen Veränderungen der NO₂- oder PM10-Konzentration in touristisch geprägten Regionen?</w:t>
+      </w:r>
+    </w:p>
+    <w:p/>
+    <w:p>
+      <w:hyperlink r:id="rId9" w:history="1">
+        <w:r>
+          <w:rPr>
+            <w:rStyle w:val="Hyperlink"/>
+          </w:rPr>
+          <w:t>https://luftqualitaet.api.bund.dev/</w:t>
+        </w:r>
+      </w:hyperlink>
+    </w:p>
+    <w:p>
+      <w:hyperlink r:id="rId10" w:history="1">
+        <w:r>
+          <w:rPr>
+            <w:rStyle w:val="Hyperlink"/>
+          </w:rPr>
+          <w:t>https://www.umweltbundesamt.de/daten/luft/luftdaten</w:t>
+        </w:r>
+      </w:hyperlink>
+    </w:p>
+    <w:p>
+      <w:hyperlink r:id="rId11" w:history="1">
+        <w:r>
+          <w:rPr>
+            <w:rStyle w:val="Hyperlink"/>
+          </w:rPr>
+          <w:t>https://www.lubw.baden-wuerttemberg.de/luft/messwerte-immissionswerte#karte</w:t>
+        </w:r>
+      </w:hyperlink>
+    </w:p>
+    <w:p/>
+    <w:p>
+      <w:pPr>
+        <w:rPr>
+          <w:u w:val="single"/>
+        </w:rPr>
+      </w:pPr>
+      <w:r>
+        <w:rPr>
+          <w:u w:val="single"/>
+        </w:rPr>
+        <w:t>Nach welchen Kriterien man gehen kann:</w:t>
+      </w:r>
+    </w:p>
+    <w:p>
+      <w:pPr>
+        <w:rPr>
+          <w:b/>
+          <w:bCs/>
+        </w:rPr>
+      </w:pPr>
+      <w:r>
+        <w:t>1)</w:t>
+      </w:r>
+      <w:r>
+        <w:t xml:space="preserve"> - gemessene Arten der Luftverschmutzung: Feinstaub - </w:t>
+      </w:r>
+      <w:r>
+        <w:t xml:space="preserve">Partikel &lt;= </w:t>
+      </w:r>
+      <w:r>
+        <w:t>10</w:t>
+      </w:r>
+      <w:r>
+        <w:t xml:space="preserve"> </w:t>
+      </w:r>
+      <w:r>
+        <w:rPr>
+          <w:b/>
+          <w:bCs/>
+        </w:rPr>
+        <w:t>µ</w:t>
+      </w:r>
+      <w:r>
+        <w:rPr>
+          <w:b/>
+          <w:bCs/>
+        </w:rPr>
+        <w:t xml:space="preserve">m </w:t>
+      </w:r>
+      <w:r>
+        <w:t>(PM10), Kohlenmonoxid (CO), Ozon (O3), Schwefeldioxid (SO2), Stickstoffdioxid (NO2), Blei im Feinstaub (PM10PB), Benzo(a)</w:t>
+      </w:r>
+      <w:proofErr w:type="spellStart"/>
+      <w:r>
+        <w:t>pyren</w:t>
+      </w:r>
+      <w:proofErr w:type="spellEnd"/>
+      <w:r>
+        <w:t xml:space="preserve"> im Feinstaub (PM10BAP), Benzol (CHB), Feinstaub - Partikel &lt;= 2 </w:t>
+      </w:r>
+      <w:r>
+        <w:rPr>
+          <w:b/>
+          <w:bCs/>
+        </w:rPr>
+        <w:t>µ</w:t>
+      </w:r>
+      <w:r>
+        <w:rPr>
+          <w:b/>
+          <w:bCs/>
+        </w:rPr>
+        <w:t xml:space="preserve">m </w:t>
+      </w:r>
+      <w:r>
+        <w:t>(PM2), Arsen im Feinstaub (PM10AS), Cadmium im Feinstaub (PM10CD), Nickel im Feinstaub (PM10NI)</w:t>
+      </w:r>
+    </w:p>
+    <w:p>
+      <w:r>
+        <w:t>2)</w:t>
+      </w:r>
+      <w:r>
+        <w:t xml:space="preserve"> - Bereiche in denen gemessen wird: alles Bundesländer + </w:t>
+      </w:r>
+      <w:r>
+        <w:t>UBA</w:t>
+      </w:r>
+    </w:p>
+    <w:p>
+      <w:r>
+        <w:t>3)</w:t>
+      </w:r>
+      <w:r>
+        <w:t xml:space="preserve"> - Tagesmittel, Ein-Stunden-Mittelwert, Ein-Stunden-Tagesmaxima, Acht-Stunden-Mittelwert, Acht-Stunden-Tagesmaxima, Tagesmittel (stündlich gleitend)</w:t>
+      </w:r>
+    </w:p>
+    <w:p>
+      <w:r>
+        <w:t>4)</w:t>
+      </w:r>
+      <w:r>
+        <w:t xml:space="preserve"> -</w:t>
+      </w:r>
+      <w:r>
+        <w:t xml:space="preserve"> </w:t>
+      </w:r>
+      <w:r>
+        <w:t>Lage der Messstation: städtisches Gebiet, vorstädtisches Gebiet, ländliches Gebiet, ländlich abgelegen, ländliche regional, ländlich stadtnah</w:t>
+      </w:r>
+    </w:p>
+    <w:p>
+      <w:r>
+        <w:t>5)</w:t>
+      </w:r>
+      <w:r>
+        <w:t xml:space="preserve"> -</w:t>
+      </w:r>
+      <w:r>
+        <w:t xml:space="preserve"> </w:t>
+      </w:r>
+      <w:r>
+        <w:t>Stationstypen (was messen sie): Hintergrund, Industrie, Verkehr</w:t>
+      </w:r>
+    </w:p>
+    <w:p>
+      <w:r>
+        <w:t>6)</w:t>
+      </w:r>
+      <w:r>
+        <w:t xml:space="preserve"> - </w:t>
+      </w:r>
+      <w:proofErr w:type="spellStart"/>
+      <w:r>
+        <w:t>Thresholds</w:t>
+      </w:r>
+      <w:proofErr w:type="spellEnd"/>
+      <w:r>
+        <w:t xml:space="preserve"> (Klassifizierungsstufen für die Luftverschmutzung): von 0 bis 4</w:t>
+      </w:r>
+    </w:p>
+    <w:p>
+      <w:r>
+        <w:t>7)</w:t>
+      </w:r>
+      <w:r>
+        <w:t xml:space="preserve"> - Ausgabe wann bestimmte Verschmutzungsgrenzen überschritten wurden</w:t>
+      </w:r>
+    </w:p>
+    <w:p>
+      <w:r>
+        <w:t>8)</w:t>
+      </w:r>
+      <w:r>
+        <w:t xml:space="preserve"> - viele der oben genannten Kriterien vereint unter einer Suchanfrage mit zeitlicher Abgrenzungsmöglichkeit</w:t>
+      </w:r>
+    </w:p>
+    <w:p/>
+    <w:p/>
+    <w:p/>
+    <w:p/>
+    <w:p/>
+    <w:p>
+      <w:r>
+        <w:lastRenderedPageBreak/>
+        <w:t>- APIs von anderen Ländern nötig zum Vergleichen für Frage 4</w:t>
+      </w:r>
+    </w:p>
+    <w:p>
+      <w:hyperlink r:id="rId12" w:history="1">
+        <w:r>
+          <w:rPr>
+            <w:rStyle w:val="Hyperlink"/>
+          </w:rPr>
+          <w:t>https://freeapis.io/i</w:t>
+        </w:r>
+        <w:r>
+          <w:rPr>
+            <w:rStyle w:val="Hyperlink"/>
+          </w:rPr>
+          <w:t>q</w:t>
+        </w:r>
+        <w:r>
+          <w:rPr>
+            <w:rStyle w:val="Hyperlink"/>
+          </w:rPr>
+          <w:t>air</w:t>
+        </w:r>
+      </w:hyperlink>
+    </w:p>
+    <w:p/>
+    <w:p>
+      <w:r>
+        <w:t>- Wetter-API nötig für Frage 6</w:t>
+      </w:r>
+    </w:p>
+    <w:p>
+      <w:hyperlink r:id="rId13" w:history="1">
+        <w:r>
+          <w:rPr>
+            <w:rStyle w:val="Hyperlink"/>
+          </w:rPr>
+          <w:t>https://open-meteo.com/en/docs</w:t>
+        </w:r>
+      </w:hyperlink>
+    </w:p>
+    <w:p/>
+    <w:p>
+      <w:r>
+        <w:t>- API für Frage 9 nötig, für Tourismuszahlen</w:t>
+      </w:r>
+    </w:p>
+    <w:p>
+      <w:hyperlink r:id="rId14" w:history="1">
+        <w:r>
+          <w:rPr>
+            <w:rStyle w:val="Hyperlink"/>
+          </w:rPr>
+          <w:t>https://data.europa.eu/en/publications/datast</w:t>
+        </w:r>
+        <w:r>
+          <w:rPr>
+            <w:rStyle w:val="Hyperlink"/>
+          </w:rPr>
+          <w:t>o</w:t>
+        </w:r>
+        <w:r>
+          <w:rPr>
+            <w:rStyle w:val="Hyperlink"/>
+          </w:rPr>
+          <w:t>ries/high-value-datasets-tourism-eu</w:t>
+        </w:r>
+      </w:hyperlink>
+    </w:p>
+    <w:p>
+      <w:hyperlink r:id="rId15" w:history="1">
+        <w:r>
+          <w:rPr>
+            <w:rStyle w:val="Hyperlink"/>
+          </w:rPr>
+          <w:t>https://www.untourism.int/tourism-statistics/tourism-statistics-data</w:t>
+        </w:r>
+        <w:r>
+          <w:rPr>
+            <w:rStyle w:val="Hyperlink"/>
+          </w:rPr>
+          <w:t>b</w:t>
+        </w:r>
+        <w:r>
+          <w:rPr>
+            <w:rStyle w:val="Hyperlink"/>
+          </w:rPr>
+          <w:t>ase</w:t>
+        </w:r>
+      </w:hyperlink>
+    </w:p>
+    <w:p>
+      <w:hyperlink r:id="rId16" w:history="1">
+        <w:r>
+          <w:rPr>
+            <w:rStyle w:val="Hyperlink"/>
+          </w:rPr>
+          <w:t>https://www.destination.one/unsere-loesung-oneproduct/ope</w:t>
+        </w:r>
+        <w:r>
+          <w:rPr>
+            <w:rStyle w:val="Hyperlink"/>
+          </w:rPr>
+          <w:t>n</w:t>
+        </w:r>
+        <w:r>
+          <w:rPr>
+            <w:rStyle w:val="Hyperlink"/>
+          </w:rPr>
+          <w:t>-data</w:t>
+        </w:r>
+      </w:hyperlink>
     </w:p>
     <w:p/>
     <w:p/>
@@ -1264,15 +1943,15 @@
     <w:lsdException w:name="Unresolved Mention" w:semiHidden="1" w:unhideWhenUsed="1"/>
     <w:lsdException w:name="Smart Link" w:semiHidden="1" w:unhideWhenUsed="1"/>
   </w:latentStyles>
-  <w:style w:type="paragraph" w:default="1" w:styleId="Normal">
+  <w:style w:type="paragraph" w:default="1" w:styleId="Standard">
     <w:name w:val="Normal"/>
     <w:qFormat/>
   </w:style>
-  <w:style w:type="paragraph" w:styleId="Heading1">
+  <w:style w:type="paragraph" w:styleId="berschrift1">
     <w:name w:val="heading 1"/>
-    <w:basedOn w:val="Normal"/>
-    <w:next w:val="Normal"/>
-    <w:link w:val="Heading1Char"/>
+    <w:basedOn w:val="Standard"/>
+    <w:next w:val="Standard"/>
+    <w:link w:val="berschrift1Zchn"/>
     <w:uiPriority w:val="9"/>
     <w:qFormat/>
     <w:rsid w:val="006C3F0D"/>
@@ -1289,11 +1968,11 @@
       <w:szCs w:val="40"/>
     </w:rPr>
   </w:style>
-  <w:style w:type="paragraph" w:styleId="Heading2">
+  <w:style w:type="paragraph" w:styleId="berschrift2">
     <w:name w:val="heading 2"/>
-    <w:basedOn w:val="Normal"/>
-    <w:next w:val="Normal"/>
-    <w:link w:val="Heading2Char"/>
+    <w:basedOn w:val="Standard"/>
+    <w:next w:val="Standard"/>
+    <w:link w:val="berschrift2Zchn"/>
     <w:uiPriority w:val="9"/>
     <w:semiHidden/>
     <w:unhideWhenUsed/>
@@ -1312,11 +1991,11 @@
       <w:szCs w:val="32"/>
     </w:rPr>
   </w:style>
-  <w:style w:type="paragraph" w:styleId="Heading3">
+  <w:style w:type="paragraph" w:styleId="berschrift3">
     <w:name w:val="heading 3"/>
-    <w:basedOn w:val="Normal"/>
-    <w:next w:val="Normal"/>
-    <w:link w:val="Heading3Char"/>
+    <w:basedOn w:val="Standard"/>
+    <w:next w:val="Standard"/>
+    <w:link w:val="berschrift3Zchn"/>
     <w:uiPriority w:val="9"/>
     <w:semiHidden/>
     <w:unhideWhenUsed/>
@@ -1335,11 +2014,11 @@
       <w:szCs w:val="28"/>
     </w:rPr>
   </w:style>
-  <w:style w:type="paragraph" w:styleId="Heading4">
+  <w:style w:type="paragraph" w:styleId="berschrift4">
     <w:name w:val="heading 4"/>
-    <w:basedOn w:val="Normal"/>
-    <w:next w:val="Normal"/>
-    <w:link w:val="Heading4Char"/>
+    <w:basedOn w:val="Standard"/>
+    <w:next w:val="Standard"/>
+    <w:link w:val="berschrift4Zchn"/>
     <w:uiPriority w:val="9"/>
     <w:semiHidden/>
     <w:unhideWhenUsed/>
@@ -1358,11 +2037,11 @@
       <w:color w:val="2F5496" w:themeColor="accent1" w:themeShade="BF"/>
     </w:rPr>
   </w:style>
-  <w:style w:type="paragraph" w:styleId="Heading5">
+  <w:style w:type="paragraph" w:styleId="berschrift5">
     <w:name w:val="heading 5"/>
-    <w:basedOn w:val="Normal"/>
-    <w:next w:val="Normal"/>
-    <w:link w:val="Heading5Char"/>
+    <w:basedOn w:val="Standard"/>
+    <w:next w:val="Standard"/>
+    <w:link w:val="berschrift5Zchn"/>
     <w:uiPriority w:val="9"/>
     <w:semiHidden/>
     <w:unhideWhenUsed/>
@@ -1379,11 +2058,11 @@
       <w:color w:val="2F5496" w:themeColor="accent1" w:themeShade="BF"/>
     </w:rPr>
   </w:style>
-  <w:style w:type="paragraph" w:styleId="Heading6">
+  <w:style w:type="paragraph" w:styleId="berschrift6">
     <w:name w:val="heading 6"/>
-    <w:basedOn w:val="Normal"/>
-    <w:next w:val="Normal"/>
-    <w:link w:val="Heading6Char"/>
+    <w:basedOn w:val="Standard"/>
+    <w:next w:val="Standard"/>
+    <w:link w:val="berschrift6Zchn"/>
     <w:uiPriority w:val="9"/>
     <w:semiHidden/>
     <w:unhideWhenUsed/>
@@ -1402,11 +2081,11 @@
       <w:color w:val="595959" w:themeColor="text1" w:themeTint="A6"/>
     </w:rPr>
   </w:style>
-  <w:style w:type="paragraph" w:styleId="Heading7">
+  <w:style w:type="paragraph" w:styleId="berschrift7">
     <w:name w:val="heading 7"/>
-    <w:basedOn w:val="Normal"/>
-    <w:next w:val="Normal"/>
-    <w:link w:val="Heading7Char"/>
+    <w:basedOn w:val="Standard"/>
+    <w:next w:val="Standard"/>
+    <w:link w:val="berschrift7Zchn"/>
     <w:uiPriority w:val="9"/>
     <w:semiHidden/>
     <w:unhideWhenUsed/>
@@ -1423,11 +2102,11 @@
       <w:color w:val="595959" w:themeColor="text1" w:themeTint="A6"/>
     </w:rPr>
   </w:style>
-  <w:style w:type="paragraph" w:styleId="Heading8">
+  <w:style w:type="paragraph" w:styleId="berschrift8">
     <w:name w:val="heading 8"/>
-    <w:basedOn w:val="Normal"/>
-    <w:next w:val="Normal"/>
-    <w:link w:val="Heading8Char"/>
+    <w:basedOn w:val="Standard"/>
+    <w:next w:val="Standard"/>
+    <w:link w:val="berschrift8Zchn"/>
     <w:uiPriority w:val="9"/>
     <w:semiHidden/>
     <w:unhideWhenUsed/>
@@ -1446,11 +2125,11 @@
       <w:color w:val="272727" w:themeColor="text1" w:themeTint="D8"/>
     </w:rPr>
   </w:style>
-  <w:style w:type="paragraph" w:styleId="Heading9">
+  <w:style w:type="paragraph" w:styleId="berschrift9">
     <w:name w:val="heading 9"/>
-    <w:basedOn w:val="Normal"/>
-    <w:next w:val="Normal"/>
-    <w:link w:val="Heading9Char"/>
+    <w:basedOn w:val="Standard"/>
+    <w:next w:val="Standard"/>
+    <w:link w:val="berschrift9Zchn"/>
     <w:uiPriority w:val="9"/>
     <w:semiHidden/>
     <w:unhideWhenUsed/>
@@ -1467,13 +2146,12 @@
       <w:color w:val="272727" w:themeColor="text1" w:themeTint="D8"/>
     </w:rPr>
   </w:style>
-  <w:style w:type="character" w:default="1" w:styleId="DefaultParagraphFont">
+  <w:style w:type="character" w:default="1" w:styleId="Absatz-Standardschriftart">
     <w:name w:val="Default Paragraph Font"/>
     <w:uiPriority w:val="1"/>
-    <w:semiHidden/>
     <w:unhideWhenUsed/>
   </w:style>
-  <w:style w:type="table" w:default="1" w:styleId="TableNormal">
+  <w:style w:type="table" w:default="1" w:styleId="NormaleTabelle">
     <w:name w:val="Normal Table"/>
     <w:uiPriority w:val="99"/>
     <w:semiHidden/>
@@ -1488,16 +2166,16 @@
       </w:tblCellMar>
     </w:tblPr>
   </w:style>
-  <w:style w:type="numbering" w:default="1" w:styleId="NoList">
+  <w:style w:type="numbering" w:default="1" w:styleId="KeineListe">
     <w:name w:val="No List"/>
     <w:uiPriority w:val="99"/>
     <w:semiHidden/>
     <w:unhideWhenUsed/>
   </w:style>
-  <w:style w:type="character" w:customStyle="1" w:styleId="Heading1Char">
-    <w:name w:val="Heading 1 Char"/>
-    <w:basedOn w:val="DefaultParagraphFont"/>
-    <w:link w:val="Heading1"/>
+  <w:style w:type="character" w:customStyle="1" w:styleId="berschrift1Zchn">
+    <w:name w:val="Überschrift 1 Zchn"/>
+    <w:basedOn w:val="Absatz-Standardschriftart"/>
+    <w:link w:val="berschrift1"/>
     <w:uiPriority w:val="9"/>
     <w:rsid w:val="006C3F0D"/>
     <w:rPr>
@@ -1507,10 +2185,10 @@
       <w:szCs w:val="40"/>
     </w:rPr>
   </w:style>
-  <w:style w:type="character" w:customStyle="1" w:styleId="Heading2Char">
-    <w:name w:val="Heading 2 Char"/>
-    <w:basedOn w:val="DefaultParagraphFont"/>
-    <w:link w:val="Heading2"/>
+  <w:style w:type="character" w:customStyle="1" w:styleId="berschrift2Zchn">
+    <w:name w:val="Überschrift 2 Zchn"/>
+    <w:basedOn w:val="Absatz-Standardschriftart"/>
+    <w:link w:val="berschrift2"/>
     <w:uiPriority w:val="9"/>
     <w:semiHidden/>
     <w:rsid w:val="006C3F0D"/>
@@ -1521,10 +2199,10 @@
       <w:szCs w:val="32"/>
     </w:rPr>
   </w:style>
-  <w:style w:type="character" w:customStyle="1" w:styleId="Heading3Char">
-    <w:name w:val="Heading 3 Char"/>
-    <w:basedOn w:val="DefaultParagraphFont"/>
-    <w:link w:val="Heading3"/>
+  <w:style w:type="character" w:customStyle="1" w:styleId="berschrift3Zchn">
+    <w:name w:val="Überschrift 3 Zchn"/>
+    <w:basedOn w:val="Absatz-Standardschriftart"/>
+    <w:link w:val="berschrift3"/>
     <w:uiPriority w:val="9"/>
     <w:semiHidden/>
     <w:rsid w:val="006C3F0D"/>
@@ -1535,10 +2213,10 @@
       <w:szCs w:val="28"/>
     </w:rPr>
   </w:style>
-  <w:style w:type="character" w:customStyle="1" w:styleId="Heading4Char">
-    <w:name w:val="Heading 4 Char"/>
-    <w:basedOn w:val="DefaultParagraphFont"/>
-    <w:link w:val="Heading4"/>
+  <w:style w:type="character" w:customStyle="1" w:styleId="berschrift4Zchn">
+    <w:name w:val="Überschrift 4 Zchn"/>
+    <w:basedOn w:val="Absatz-Standardschriftart"/>
+    <w:link w:val="berschrift4"/>
     <w:uiPriority w:val="9"/>
     <w:semiHidden/>
     <w:rsid w:val="006C3F0D"/>
@@ -1549,10 +2227,10 @@
       <w:color w:val="2F5496" w:themeColor="accent1" w:themeShade="BF"/>
     </w:rPr>
   </w:style>
-  <w:style w:type="character" w:customStyle="1" w:styleId="Heading5Char">
-    <w:name w:val="Heading 5 Char"/>
-    <w:basedOn w:val="DefaultParagraphFont"/>
-    <w:link w:val="Heading5"/>
+  <w:style w:type="character" w:customStyle="1" w:styleId="berschrift5Zchn">
+    <w:name w:val="Überschrift 5 Zchn"/>
+    <w:basedOn w:val="Absatz-Standardschriftart"/>
+    <w:link w:val="berschrift5"/>
     <w:uiPriority w:val="9"/>
     <w:semiHidden/>
     <w:rsid w:val="006C3F0D"/>
@@ -1561,10 +2239,10 @@
       <w:color w:val="2F5496" w:themeColor="accent1" w:themeShade="BF"/>
     </w:rPr>
   </w:style>
-  <w:style w:type="character" w:customStyle="1" w:styleId="Heading6Char">
-    <w:name w:val="Heading 6 Char"/>
-    <w:basedOn w:val="DefaultParagraphFont"/>
-    <w:link w:val="Heading6"/>
+  <w:style w:type="character" w:customStyle="1" w:styleId="berschrift6Zchn">
+    <w:name w:val="Überschrift 6 Zchn"/>
+    <w:basedOn w:val="Absatz-Standardschriftart"/>
+    <w:link w:val="berschrift6"/>
     <w:uiPriority w:val="9"/>
     <w:semiHidden/>
     <w:rsid w:val="006C3F0D"/>
@@ -1575,10 +2253,10 @@
       <w:color w:val="595959" w:themeColor="text1" w:themeTint="A6"/>
     </w:rPr>
   </w:style>
-  <w:style w:type="character" w:customStyle="1" w:styleId="Heading7Char">
-    <w:name w:val="Heading 7 Char"/>
-    <w:basedOn w:val="DefaultParagraphFont"/>
-    <w:link w:val="Heading7"/>
+  <w:style w:type="character" w:customStyle="1" w:styleId="berschrift7Zchn">
+    <w:name w:val="Überschrift 7 Zchn"/>
+    <w:basedOn w:val="Absatz-Standardschriftart"/>
+    <w:link w:val="berschrift7"/>
     <w:uiPriority w:val="9"/>
     <w:semiHidden/>
     <w:rsid w:val="006C3F0D"/>
@@ -1587,10 +2265,10 @@
       <w:color w:val="595959" w:themeColor="text1" w:themeTint="A6"/>
     </w:rPr>
   </w:style>
-  <w:style w:type="character" w:customStyle="1" w:styleId="Heading8Char">
-    <w:name w:val="Heading 8 Char"/>
-    <w:basedOn w:val="DefaultParagraphFont"/>
-    <w:link w:val="Heading8"/>
+  <w:style w:type="character" w:customStyle="1" w:styleId="berschrift8Zchn">
+    <w:name w:val="Überschrift 8 Zchn"/>
+    <w:basedOn w:val="Absatz-Standardschriftart"/>
+    <w:link w:val="berschrift8"/>
     <w:uiPriority w:val="9"/>
     <w:semiHidden/>
     <w:rsid w:val="006C3F0D"/>
@@ -1601,10 +2279,10 @@
       <w:color w:val="272727" w:themeColor="text1" w:themeTint="D8"/>
     </w:rPr>
   </w:style>
-  <w:style w:type="character" w:customStyle="1" w:styleId="Heading9Char">
-    <w:name w:val="Heading 9 Char"/>
-    <w:basedOn w:val="DefaultParagraphFont"/>
-    <w:link w:val="Heading9"/>
+  <w:style w:type="character" w:customStyle="1" w:styleId="berschrift9Zchn">
+    <w:name w:val="Überschrift 9 Zchn"/>
+    <w:basedOn w:val="Absatz-Standardschriftart"/>
+    <w:link w:val="berschrift9"/>
     <w:uiPriority w:val="9"/>
     <w:semiHidden/>
     <w:rsid w:val="006C3F0D"/>
@@ -1613,11 +2291,11 @@
       <w:color w:val="272727" w:themeColor="text1" w:themeTint="D8"/>
     </w:rPr>
   </w:style>
-  <w:style w:type="paragraph" w:styleId="Title">
+  <w:style w:type="paragraph" w:styleId="Titel">
     <w:name w:val="Title"/>
-    <w:basedOn w:val="Normal"/>
-    <w:next w:val="Normal"/>
-    <w:link w:val="TitleChar"/>
+    <w:basedOn w:val="Standard"/>
+    <w:next w:val="Standard"/>
+    <w:link w:val="TitelZchn"/>
     <w:uiPriority w:val="10"/>
     <w:qFormat/>
     <w:rsid w:val="006C3F0D"/>
@@ -1633,10 +2311,10 @@
       <w:szCs w:val="56"/>
     </w:rPr>
   </w:style>
-  <w:style w:type="character" w:customStyle="1" w:styleId="TitleChar">
-    <w:name w:val="Title Char"/>
-    <w:basedOn w:val="DefaultParagraphFont"/>
-    <w:link w:val="Title"/>
+  <w:style w:type="character" w:customStyle="1" w:styleId="TitelZchn">
+    <w:name w:val="Titel Zchn"/>
+    <w:basedOn w:val="Absatz-Standardschriftart"/>
+    <w:link w:val="Titel"/>
     <w:uiPriority w:val="10"/>
     <w:rsid w:val="006C3F0D"/>
     <w:rPr>
@@ -1647,11 +2325,11 @@
       <w:szCs w:val="56"/>
     </w:rPr>
   </w:style>
-  <w:style w:type="paragraph" w:styleId="Subtitle">
+  <w:style w:type="paragraph" w:styleId="Untertitel">
     <w:name w:val="Subtitle"/>
-    <w:basedOn w:val="Normal"/>
-    <w:next w:val="Normal"/>
-    <w:link w:val="SubtitleChar"/>
+    <w:basedOn w:val="Standard"/>
+    <w:next w:val="Standard"/>
+    <w:link w:val="UntertitelZchn"/>
     <w:uiPriority w:val="11"/>
     <w:qFormat/>
     <w:rsid w:val="006C3F0D"/>
@@ -1668,10 +2346,10 @@
       <w:szCs w:val="28"/>
     </w:rPr>
   </w:style>
-  <w:style w:type="character" w:customStyle="1" w:styleId="SubtitleChar">
-    <w:name w:val="Subtitle Char"/>
-    <w:basedOn w:val="DefaultParagraphFont"/>
-    <w:link w:val="Subtitle"/>
+  <w:style w:type="character" w:customStyle="1" w:styleId="UntertitelZchn">
+    <w:name w:val="Untertitel Zchn"/>
+    <w:basedOn w:val="Absatz-Standardschriftart"/>
+    <w:link w:val="Untertitel"/>
     <w:uiPriority w:val="11"/>
     <w:rsid w:val="006C3F0D"/>
     <w:rPr>
@@ -1682,11 +2360,11 @@
       <w:szCs w:val="28"/>
     </w:rPr>
   </w:style>
-  <w:style w:type="paragraph" w:styleId="Quote">
+  <w:style w:type="paragraph" w:styleId="Zitat">
     <w:name w:val="Quote"/>
-    <w:basedOn w:val="Normal"/>
-    <w:next w:val="Normal"/>
-    <w:link w:val="QuoteChar"/>
+    <w:basedOn w:val="Standard"/>
+    <w:next w:val="Standard"/>
+    <w:link w:val="ZitatZchn"/>
     <w:uiPriority w:val="29"/>
     <w:qFormat/>
     <w:rsid w:val="006C3F0D"/>
@@ -1700,10 +2378,10 @@
       <w:color w:val="404040" w:themeColor="text1" w:themeTint="BF"/>
     </w:rPr>
   </w:style>
-  <w:style w:type="character" w:customStyle="1" w:styleId="QuoteChar">
-    <w:name w:val="Quote Char"/>
-    <w:basedOn w:val="DefaultParagraphFont"/>
-    <w:link w:val="Quote"/>
+  <w:style w:type="character" w:customStyle="1" w:styleId="ZitatZchn">
+    <w:name w:val="Zitat Zchn"/>
+    <w:basedOn w:val="Absatz-Standardschriftart"/>
+    <w:link w:val="Zitat"/>
     <w:uiPriority w:val="29"/>
     <w:rsid w:val="006C3F0D"/>
     <w:rPr>
@@ -1712,9 +2390,9 @@
       <w:color w:val="404040" w:themeColor="text1" w:themeTint="BF"/>
     </w:rPr>
   </w:style>
-  <w:style w:type="paragraph" w:styleId="ListParagraph">
+  <w:style w:type="paragraph" w:styleId="Listenabsatz">
     <w:name w:val="List Paragraph"/>
-    <w:basedOn w:val="Normal"/>
+    <w:basedOn w:val="Standard"/>
     <w:uiPriority w:val="34"/>
     <w:qFormat/>
     <w:rsid w:val="006C3F0D"/>
@@ -1723,9 +2401,9 @@
       <w:contextualSpacing/>
     </w:pPr>
   </w:style>
-  <w:style w:type="character" w:styleId="IntenseEmphasis">
+  <w:style w:type="character" w:styleId="IntensiveHervorhebung">
     <w:name w:val="Intense Emphasis"/>
-    <w:basedOn w:val="DefaultParagraphFont"/>
+    <w:basedOn w:val="Absatz-Standardschriftart"/>
     <w:uiPriority w:val="21"/>
     <w:qFormat/>
     <w:rsid w:val="006C3F0D"/>
@@ -1735,11 +2413,11 @@
       <w:color w:val="2F5496" w:themeColor="accent1" w:themeShade="BF"/>
     </w:rPr>
   </w:style>
-  <w:style w:type="paragraph" w:styleId="IntenseQuote">
+  <w:style w:type="paragraph" w:styleId="IntensivesZitat">
     <w:name w:val="Intense Quote"/>
-    <w:basedOn w:val="Normal"/>
-    <w:next w:val="Normal"/>
-    <w:link w:val="IntenseQuoteChar"/>
+    <w:basedOn w:val="Standard"/>
+    <w:next w:val="Standard"/>
+    <w:link w:val="IntensivesZitatZchn"/>
     <w:uiPriority w:val="30"/>
     <w:qFormat/>
     <w:rsid w:val="006C3F0D"/>
@@ -1758,10 +2436,10 @@
       <w:color w:val="2F5496" w:themeColor="accent1" w:themeShade="BF"/>
     </w:rPr>
   </w:style>
-  <w:style w:type="character" w:customStyle="1" w:styleId="IntenseQuoteChar">
-    <w:name w:val="Intense Quote Char"/>
-    <w:basedOn w:val="DefaultParagraphFont"/>
-    <w:link w:val="IntenseQuote"/>
+  <w:style w:type="character" w:customStyle="1" w:styleId="IntensivesZitatZchn">
+    <w:name w:val="Intensives Zitat Zchn"/>
+    <w:basedOn w:val="Absatz-Standardschriftart"/>
+    <w:link w:val="IntensivesZitat"/>
     <w:uiPriority w:val="30"/>
     <w:rsid w:val="006C3F0D"/>
     <w:rPr>
@@ -1770,9 +2448,9 @@
       <w:color w:val="2F5496" w:themeColor="accent1" w:themeShade="BF"/>
     </w:rPr>
   </w:style>
-  <w:style w:type="character" w:styleId="IntenseReference">
+  <w:style w:type="character" w:styleId="IntensiverVerweis">
     <w:name w:val="Intense Reference"/>
-    <w:basedOn w:val="DefaultParagraphFont"/>
+    <w:basedOn w:val="Absatz-Standardschriftart"/>
     <w:uiPriority w:val="32"/>
     <w:qFormat/>
     <w:rsid w:val="006C3F0D"/>
@@ -1786,7 +2464,7 @@
   </w:style>
   <w:style w:type="character" w:styleId="Hyperlink">
     <w:name w:val="Hyperlink"/>
-    <w:basedOn w:val="DefaultParagraphFont"/>
+    <w:basedOn w:val="Absatz-Standardschriftart"/>
     <w:uiPriority w:val="99"/>
     <w:unhideWhenUsed/>
     <w:rsid w:val="0006528B"/>
@@ -1795,9 +2473,9 @@
       <w:u w:val="single"/>
     </w:rPr>
   </w:style>
-  <w:style w:type="character" w:styleId="UnresolvedMention">
+  <w:style w:type="character" w:styleId="NichtaufgelsteErwhnung">
     <w:name w:val="Unresolved Mention"/>
-    <w:basedOn w:val="DefaultParagraphFont"/>
+    <w:basedOn w:val="Absatz-Standardschriftart"/>
     <w:uiPriority w:val="99"/>
     <w:semiHidden/>
     <w:unhideWhenUsed/>
@@ -1807,9 +2485,9 @@
       <w:shd w:val="clear" w:color="auto" w:fill="E1DFDD"/>
     </w:rPr>
   </w:style>
-  <w:style w:type="character" w:styleId="FollowedHyperlink">
+  <w:style w:type="character" w:styleId="BesuchterLink">
     <w:name w:val="FollowedHyperlink"/>
-    <w:basedOn w:val="DefaultParagraphFont"/>
+    <w:basedOn w:val="Absatz-Standardschriftart"/>
     <w:uiPriority w:val="99"/>
     <w:semiHidden/>
     <w:unhideWhenUsed/>
@@ -1817,6 +2495,36 @@
     <w:rPr>
       <w:color w:val="954F72" w:themeColor="followedHyperlink"/>
       <w:u w:val="single"/>
+    </w:rPr>
+  </w:style>
+  <w:style w:type="paragraph" w:styleId="HTMLVorformatiert">
+    <w:name w:val="HTML Preformatted"/>
+    <w:basedOn w:val="Standard"/>
+    <w:link w:val="HTMLVorformatiertZchn"/>
+    <w:uiPriority w:val="99"/>
+    <w:semiHidden/>
+    <w:unhideWhenUsed/>
+    <w:rsid w:val="00D86DC5"/>
+    <w:pPr>
+      <w:spacing w:after="0" w:line="240" w:lineRule="auto"/>
+    </w:pPr>
+    <w:rPr>
+      <w:rFonts w:ascii="Consolas" w:hAnsi="Consolas"/>
+      <w:sz w:val="20"/>
+      <w:szCs w:val="20"/>
+    </w:rPr>
+  </w:style>
+  <w:style w:type="character" w:customStyle="1" w:styleId="HTMLVorformatiertZchn">
+    <w:name w:val="HTML Vorformatiert Zchn"/>
+    <w:basedOn w:val="Absatz-Standardschriftart"/>
+    <w:link w:val="HTMLVorformatiert"/>
+    <w:uiPriority w:val="99"/>
+    <w:semiHidden/>
+    <w:rsid w:val="00D86DC5"/>
+    <w:rPr>
+      <w:rFonts w:ascii="Consolas" w:hAnsi="Consolas"/>
+      <w:sz w:val="20"/>
+      <w:szCs w:val="20"/>
     </w:rPr>
   </w:style>
 </w:styles>

</xml_diff>

<commit_message>
Tests an jobberse/jobsuche-service durchgeführt + Datensatz mit 10000 Einträgen testweise gezogen
</commit_message>
<xml_diff>
--- a/API Ideen.docx
+++ b/API Ideen.docx
@@ -705,19 +705,7 @@
         <w:rPr>
           <w:u w:val="single"/>
         </w:rPr>
-        <w:t xml:space="preserve">Urban vs. </w:t>
-      </w:r>
-      <w:r>
-        <w:rPr>
-          <w:u w:val="single"/>
-        </w:rPr>
-        <w:t>L</w:t>
-      </w:r>
-      <w:r>
-        <w:rPr>
-          <w:u w:val="single"/>
-        </w:rPr>
-        <w:t>ändlich</w:t>
+        <w:t>Urban vs. Ländlich</w:t>
       </w:r>
     </w:p>
     <w:p>
@@ -774,10 +762,7 @@
         <w:t>5</w:t>
       </w:r>
       <w:r>
-        <w:t>?</w:t>
-      </w:r>
-      <w:r>
-        <w:t xml:space="preserve"> </w:t>
+        <w:t xml:space="preserve">? </w:t>
       </w:r>
       <w:r>
         <w:t>(wenn möglich)</w:t>
@@ -1011,7 +996,7 @@
       </w:hyperlink>
     </w:p>
     <w:p>
-      <w:hyperlink r:id="rId11" w:history="1">
+      <w:hyperlink r:id="rId11" w:anchor="karte" w:history="1">
         <w:r>
           <w:rPr>
             <w:rStyle w:val="Hyperlink"/>
@@ -1045,16 +1030,7 @@
         <w:t>1)</w:t>
       </w:r>
       <w:r>
-        <w:t xml:space="preserve"> - gemessene Arten der Luftverschmutzung: Feinstaub - </w:t>
-      </w:r>
-      <w:r>
-        <w:t xml:space="preserve">Partikel &lt;= </w:t>
-      </w:r>
-      <w:r>
-        <w:t>10</w:t>
-      </w:r>
-      <w:r>
-        <w:t xml:space="preserve"> </w:t>
+        <w:t xml:space="preserve"> - gemessene Arten der Luftverschmutzung: Feinstaub - Partikel &lt;= 10 </w:t>
       </w:r>
       <w:r>
         <w:rPr>
@@ -1195,19 +1171,19 @@
           <w:rPr>
             <w:rStyle w:val="Hyperlink"/>
           </w:rPr>
-          <w:t>https://freeapis.io/i</w:t>
+          <w:t>https://freea</w:t>
         </w:r>
         <w:r>
           <w:rPr>
             <w:rStyle w:val="Hyperlink"/>
           </w:rPr>
-          <w:t>q</w:t>
+          <w:t>p</w:t>
         </w:r>
         <w:r>
           <w:rPr>
             <w:rStyle w:val="Hyperlink"/>
           </w:rPr>
-          <w:t>air</w:t>
+          <w:t>is.io/iqair</w:t>
         </w:r>
       </w:hyperlink>
     </w:p>
@@ -1223,23 +1199,7 @@
           <w:rPr>
             <w:rStyle w:val="Hyperlink"/>
           </w:rPr>
-          <w:t>https://open-meteo.com/en/docs</w:t>
-        </w:r>
-      </w:hyperlink>
-    </w:p>
-    <w:p/>
-    <w:p>
-      <w:r>
-        <w:t>- API für Frage 9 nötig, für Tourismuszahlen</w:t>
-      </w:r>
-    </w:p>
-    <w:p>
-      <w:hyperlink r:id="rId14" w:history="1">
-        <w:r>
-          <w:rPr>
-            <w:rStyle w:val="Hyperlink"/>
-          </w:rPr>
-          <w:t>https://data.europa.eu/en/publications/datast</w:t>
+          <w:t>https://open-mete</w:t>
         </w:r>
         <w:r>
           <w:rPr>
@@ -1251,39 +1211,23 @@
           <w:rPr>
             <w:rStyle w:val="Hyperlink"/>
           </w:rPr>
-          <w:t>ries/high-value-datasets-tourism-eu</w:t>
+          <w:t>.com/en/docs</w:t>
         </w:r>
       </w:hyperlink>
     </w:p>
-    <w:p>
-      <w:hyperlink r:id="rId15" w:history="1">
+    <w:p/>
+    <w:p>
+      <w:r>
+        <w:t>- API für Frage 9 nötig, für Tourismuszahlen</w:t>
+      </w:r>
+    </w:p>
+    <w:p>
+      <w:hyperlink r:id="rId14" w:history="1">
         <w:r>
           <w:rPr>
             <w:rStyle w:val="Hyperlink"/>
           </w:rPr>
-          <w:t>https://www.untourism.int/tourism-statistics/tourism-statistics-data</w:t>
-        </w:r>
-        <w:r>
-          <w:rPr>
-            <w:rStyle w:val="Hyperlink"/>
-          </w:rPr>
-          <w:t>b</w:t>
-        </w:r>
-        <w:r>
-          <w:rPr>
-            <w:rStyle w:val="Hyperlink"/>
-          </w:rPr>
-          <w:t>ase</w:t>
-        </w:r>
-      </w:hyperlink>
-    </w:p>
-    <w:p>
-      <w:hyperlink r:id="rId16" w:history="1">
-        <w:r>
-          <w:rPr>
-            <w:rStyle w:val="Hyperlink"/>
-          </w:rPr>
-          <w:t>https://www.destination.one/unsere-loesung-oneproduct/ope</w:t>
+          <w:t>https://data.europa.eu/e</w:t>
         </w:r>
         <w:r>
           <w:rPr>
@@ -1295,7 +1239,51 @@
           <w:rPr>
             <w:rStyle w:val="Hyperlink"/>
           </w:rPr>
-          <w:t>-data</w:t>
+          <w:t>/publications/datastories/high-value-datasets-tourism-eu</w:t>
+        </w:r>
+      </w:hyperlink>
+    </w:p>
+    <w:p>
+      <w:hyperlink r:id="rId15" w:history="1">
+        <w:r>
+          <w:rPr>
+            <w:rStyle w:val="Hyperlink"/>
+          </w:rPr>
+          <w:t>https://www.u</w:t>
+        </w:r>
+        <w:r>
+          <w:rPr>
+            <w:rStyle w:val="Hyperlink"/>
+          </w:rPr>
+          <w:t>n</w:t>
+        </w:r>
+        <w:r>
+          <w:rPr>
+            <w:rStyle w:val="Hyperlink"/>
+          </w:rPr>
+          <w:t>tourism.int/tourism-statistics/tourism-statistics-database</w:t>
+        </w:r>
+      </w:hyperlink>
+    </w:p>
+    <w:p>
+      <w:hyperlink r:id="rId16" w:history="1">
+        <w:r>
+          <w:rPr>
+            <w:rStyle w:val="Hyperlink"/>
+          </w:rPr>
+          <w:t>https://www.destination.one/unse</w:t>
+        </w:r>
+        <w:r>
+          <w:rPr>
+            <w:rStyle w:val="Hyperlink"/>
+          </w:rPr>
+          <w:t>r</w:t>
+        </w:r>
+        <w:r>
+          <w:rPr>
+            <w:rStyle w:val="Hyperlink"/>
+          </w:rPr>
+          <w:t>e-loesung-oneproduct/open-data</w:t>
         </w:r>
       </w:hyperlink>
     </w:p>
@@ -2149,6 +2137,7 @@
   <w:style w:type="character" w:default="1" w:styleId="Absatz-Standardschriftart">
     <w:name w:val="Default Paragraph Font"/>
     <w:uiPriority w:val="1"/>
+    <w:semiHidden/>
     <w:unhideWhenUsed/>
   </w:style>
   <w:style w:type="table" w:default="1" w:styleId="NormaleTabelle">

</xml_diff>

<commit_message>
Bsp. Brandenburg Daten für 1 Jahr für PM10
</commit_message>
<xml_diff>
--- a/API Ideen.docx
+++ b/API Ideen.docx
@@ -1171,19 +1171,7 @@
           <w:rPr>
             <w:rStyle w:val="Hyperlink"/>
           </w:rPr>
-          <w:t>https://freea</w:t>
-        </w:r>
-        <w:r>
-          <w:rPr>
-            <w:rStyle w:val="Hyperlink"/>
-          </w:rPr>
-          <w:t>p</w:t>
-        </w:r>
-        <w:r>
-          <w:rPr>
-            <w:rStyle w:val="Hyperlink"/>
-          </w:rPr>
-          <w:t>is.io/iqair</w:t>
+          <w:t>https://freeapis.io/iqair</w:t>
         </w:r>
       </w:hyperlink>
     </w:p>
@@ -1199,19 +1187,7 @@
           <w:rPr>
             <w:rStyle w:val="Hyperlink"/>
           </w:rPr>
-          <w:t>https://open-mete</w:t>
-        </w:r>
-        <w:r>
-          <w:rPr>
-            <w:rStyle w:val="Hyperlink"/>
-          </w:rPr>
-          <w:t>o</w:t>
-        </w:r>
-        <w:r>
-          <w:rPr>
-            <w:rStyle w:val="Hyperlink"/>
-          </w:rPr>
-          <w:t>.com/en/docs</w:t>
+          <w:t>https://open-meteo.com/en/docs</w:t>
         </w:r>
       </w:hyperlink>
     </w:p>
@@ -1227,19 +1203,7 @@
           <w:rPr>
             <w:rStyle w:val="Hyperlink"/>
           </w:rPr>
-          <w:t>https://data.europa.eu/e</w:t>
-        </w:r>
-        <w:r>
-          <w:rPr>
-            <w:rStyle w:val="Hyperlink"/>
-          </w:rPr>
-          <w:t>n</w:t>
-        </w:r>
-        <w:r>
-          <w:rPr>
-            <w:rStyle w:val="Hyperlink"/>
-          </w:rPr>
-          <w:t>/publications/datastories/high-value-datasets-tourism-eu</w:t>
+          <w:t>https://data.europa.eu/en/publications/datastories/high-value-datasets-tourism-eu</w:t>
         </w:r>
       </w:hyperlink>
     </w:p>
@@ -1249,19 +1213,7 @@
           <w:rPr>
             <w:rStyle w:val="Hyperlink"/>
           </w:rPr>
-          <w:t>https://www.u</w:t>
-        </w:r>
-        <w:r>
-          <w:rPr>
-            <w:rStyle w:val="Hyperlink"/>
-          </w:rPr>
-          <w:t>n</w:t>
-        </w:r>
-        <w:r>
-          <w:rPr>
-            <w:rStyle w:val="Hyperlink"/>
-          </w:rPr>
-          <w:t>tourism.int/tourism-statistics/tourism-statistics-database</w:t>
+          <w:t>https://www.untourism.int/tourism-statistics/tourism-statistics-database</w:t>
         </w:r>
       </w:hyperlink>
     </w:p>
@@ -1271,19 +1223,7 @@
           <w:rPr>
             <w:rStyle w:val="Hyperlink"/>
           </w:rPr>
-          <w:t>https://www.destination.one/unse</w:t>
-        </w:r>
-        <w:r>
-          <w:rPr>
-            <w:rStyle w:val="Hyperlink"/>
-          </w:rPr>
-          <w:t>r</w:t>
-        </w:r>
-        <w:r>
-          <w:rPr>
-            <w:rStyle w:val="Hyperlink"/>
-          </w:rPr>
-          <w:t>e-loesung-oneproduct/open-data</w:t>
+          <w:t>https://www.destination.one/unsere-loesung-oneproduct/open-data</w:t>
         </w:r>
       </w:hyperlink>
     </w:p>

</xml_diff>

<commit_message>
CSVs für PM2,5 und NO2 erstellt
</commit_message>
<xml_diff>
--- a/API Ideen.docx
+++ b/API Ideen.docx
@@ -472,22 +472,30 @@
         <w:pStyle w:val="Listenabsatz"/>
       </w:pPr>
       <w:r>
-        <w:t>Wie haben sich die Jahresmittelwerte der Konzentrationen von PM10, PM2.5 und NO₂ in Deutschland im Zeitraum 200</w:t>
-      </w:r>
-      <w:r>
-        <w:t>0</w:t>
+        <w:t>Wie haben sich die Jahresmittelwerte der Konzentrationen von PM10, PM2.5 und NO₂ in Deutschland im Zeitraum 20</w:t>
+      </w:r>
+      <w:r>
+        <w:t>16</w:t>
       </w:r>
       <w:r>
         <w:t>–202</w:t>
       </w:r>
       <w:r>
-        <w:t>5</w:t>
+        <w:t>6</w:t>
       </w:r>
       <w:r>
         <w:t xml:space="preserve"> entwickelt?</w:t>
       </w:r>
       <w:r>
-        <w:t xml:space="preserve"> (könnte man auch auf Monate runterbrechen)</w:t>
+        <w:t xml:space="preserve"> (</w:t>
+      </w:r>
+      <w:proofErr w:type="spellStart"/>
+      <w:r>
+        <w:t>maybe</w:t>
+      </w:r>
+      <w:proofErr w:type="spellEnd"/>
+      <w:r>
+        <w:t xml:space="preserve"> alle restlichen Werte auch)</w:t>
       </w:r>
     </w:p>
     <w:p>
@@ -524,18 +532,19 @@
         <w:pStyle w:val="Listenabsatz"/>
       </w:pPr>
       <w:r>
-        <w:t>Gab es während der COVID-19-bedingten Mobilitätseinschränkungen (März–Mai 2020) signifikante Veränderungen der NO₂- und PM10-Konzentrationen im Vergleich zu den Vorjahreszeiträumen 2017–2019?</w:t>
-      </w:r>
-      <w:r>
-        <w:t xml:space="preserve"> (</w:t>
-      </w:r>
-      <w:proofErr w:type="spellStart"/>
-      <w:r>
-        <w:t>maybe</w:t>
-      </w:r>
-      <w:proofErr w:type="spellEnd"/>
-      <w:r>
-        <w:t xml:space="preserve"> zwei Jahre vorher und nachher abbilden)</w:t>
+        <w:t>Gab es während der COVID-19-bedingten Mobilitätseinschränkungen (März–Mai 2020) signifikante Veränderungen der NO₂- und PM10-Konzentrationen im Vergleich zu den Vorjahreszeiträumen 201</w:t>
+      </w:r>
+      <w:r>
+        <w:t>9</w:t>
+      </w:r>
+      <w:r>
+        <w:t>–20</w:t>
+      </w:r>
+      <w:r>
+        <w:t>21</w:t>
+      </w:r>
+      <w:r>
+        <w:t>?</w:t>
       </w:r>
     </w:p>
     <w:p>
@@ -581,17 +590,20 @@
         <w:t>-Tagesmittelwerte am 1. Januar signifikant zwischen den Jahren 20</w:t>
       </w:r>
       <w:r>
-        <w:t>00</w:t>
+        <w:t>16</w:t>
       </w:r>
       <w:r>
         <w:t>–202</w:t>
       </w:r>
       <w:r>
-        <w:t>5</w:t>
+        <w:t>6</w:t>
       </w:r>
       <w:r>
         <w:t>?</w:t>
       </w:r>
+      <w:r>
+        <w:t xml:space="preserve"> (Grafik für Dezember + Januar jeweils für die Jahre zum durchklicken)</w:t>
+      </w:r>
     </w:p>
     <w:p>
       <w:pPr>
@@ -664,16 +676,37 @@
         <w:pStyle w:val="Listenabsatz"/>
       </w:pPr>
       <w:r>
-        <w:t>Bestehen signifikante Unterschiede in den Jahresmittelwerten von PM2.5 zwischen den Bundesländern im Zeitraum 20</w:t>
-      </w:r>
-      <w:r>
-        <w:t>00</w:t>
+        <w:t>Bestehen signifikante Unterschiede in den Jahresmittelwerten von PM</w:t>
+      </w:r>
+      <w:r>
+        <w:t>10</w:t>
+      </w:r>
+      <w:r>
+        <w:t>, PM2,5 und NO</w:t>
+      </w:r>
+      <w:r>
+        <w:rPr>
+          <w:vertAlign w:val="subscript"/>
+        </w:rPr>
+        <w:t>2</w:t>
+      </w:r>
+      <w:r>
+        <w:rPr>
+          <w:vertAlign w:val="subscript"/>
+        </w:rPr>
+        <w:t xml:space="preserve"> </w:t>
+      </w:r>
+      <w:r>
+        <w:t>zwischen den Bundesländern im Zeitraum 20</w:t>
+      </w:r>
+      <w:r>
+        <w:t>16</w:t>
       </w:r>
       <w:r>
         <w:t>–202</w:t>
       </w:r>
       <w:r>
-        <w:t>5</w:t>
+        <w:t>6</w:t>
       </w:r>
       <w:r>
         <w:t>?</w:t>
@@ -750,16 +783,16 @@
         <w:pStyle w:val="Listenabsatz"/>
       </w:pPr>
       <w:r>
-        <w:t>Wie unterscheiden sich die Jahresmittelwerte von PM2.5 zwischen Deutschland und vergleichbaren EU-Ländern im Zeitraum 20</w:t>
-      </w:r>
-      <w:r>
-        <w:t>00</w:t>
+        <w:t>Wie unterscheiden sich die Jahresmittelwerte von PM2.5 zwischen Deutschland und vergleichbaren EU-Ländern im Zeitraum 2</w:t>
+      </w:r>
+      <w:r>
+        <w:t>016</w:t>
       </w:r>
       <w:r>
         <w:t>–202</w:t>
       </w:r>
       <w:r>
-        <w:t>5</w:t>
+        <w:t>6</w:t>
       </w:r>
       <w:r>
         <w:t xml:space="preserve">? </w:t>

</xml_diff>